<commit_message>
Measured benchmarks (results.md/json); README, deck and description use measured numbers and honest memory figures
</commit_message>
<xml_diff>
--- a/docs/description/Sahaay_Project_Description.docx
+++ b/docs/description/Sahaay_Project_Description.docx
@@ -213,7 +213,7 @@
         <w:spacing w:after="40"/>
       </w:pPr>
       <w:r>
-        <w:t>Face detector 0.42 ms and face mesh 0.16 ms on the NPU (2.97 ms and 1.01 ms on CPU); full live pipeline 2.7 ms per frame at 28 fps.</w:t>
+        <w:t>Face detector 0.43 ms and face mesh 0.16 ms on the NPU (2.75 ms and 0.87 ms on CPU); the full live pipeline takes 2.74 ms per frame on the NPU against 25.3 ms on the CPU.</w:t>
       </w:r>
     </w:p>
     <w:p>
@@ -222,7 +222,7 @@
         <w:spacing w:after="40"/>
       </w:pPr>
       <w:r>
-        <w:t>Whisper base: encoder 25 ms, decoder 3.0 ms per token; a six-second command transcribes in about 100 ms.</w:t>
+        <w:t>Whisper base: encoder 22 ms, decoder 2.7 ms per token; a 5.6-second command transcribes in 79 ms.</w:t>
       </w:r>
     </w:p>
     <w:p>
@@ -231,7 +231,7 @@
         <w:spacing w:after="40"/>
       </w:pPr>
       <w:r>
-        <w:t>Qwen3-4B: 60 ms to first token, 33 tokens per second; Qwen3-VL-4B: 280 ms to first token, 30 tokens per second, a screen description in about 2.3 s.</w:t>
+        <w:t>Qwen3-4B with the screen context: 243 ms to first token, 30.9 tokens per second; Qwen3-VL-4B: 269 ms to first token, 25.3 tokens per second; each loads in about 10 s.</w:t>
       </w:r>
     </w:p>
     <w:p>
@@ -249,7 +249,7 @@
         <w:spacing w:after="40"/>
       </w:pPr>
       <w:r>
-        <w:t>Memory: about 5 GB resident with both generative models loaded; fits a 16 GB OmniBook.</w:t>
+        <w:t>Memory, measured as process growth: 5.4 GB for the language model and 6.1 GB for the vision-language model. Hands-free mode fits a 16 GB OmniBook; both generative models together need 32 GB, or the 2B vision model on 16 GB.</w:t>
       </w:r>
     </w:p>
     <w:p>

</xml_diff>